<commit_message>
Update ebook deliverables and asset metadata
Replit-Commit-Author: Agent
</commit_message>
<xml_diff>
--- a/deliverables/Bonus_Mini_Ebook_Audit_SBU_SKK_14_Hari.docx
+++ b/deliverables/Bonus_Mini_Ebook_Audit_SBU_SKK_14_Hari.docx
@@ -2,59 +2,6 @@
 <file path=word/document.xml><?xml version="1.0" encoding="utf-8"?>
 <w:document xmlns:wpc="http://schemas.microsoft.com/office/word/2010/wordprocessingCanvas" xmlns:mo="http://schemas.microsoft.com/office/mac/office/2008/main" xmlns:mc="http://schemas.openxmlformats.org/markup-compatibility/2006" xmlns:mv="urn:schemas-microsoft-com:mac:vml" xmlns:o="urn:schemas-microsoft-com:office:office" xmlns:r="http://schemas.openxmlformats.org/officeDocument/2006/relationships" xmlns:m="http://schemas.openxmlformats.org/officeDocument/2006/math" xmlns:v="urn:schemas-microsoft-com:vml" xmlns:wp14="http://schemas.microsoft.com/office/word/2010/wordprocessingDrawing" xmlns:wp="http://schemas.openxmlformats.org/drawingml/2006/wordprocessingDrawing" xmlns:w10="urn:schemas-microsoft-com:office:word" xmlns:w="http://schemas.openxmlformats.org/wordprocessingml/2006/main" xmlns:w14="http://schemas.microsoft.com/office/word/2010/wordml" xmlns:wpg="http://schemas.microsoft.com/office/word/2010/wordprocessingGroup" xmlns:wpi="http://schemas.microsoft.com/office/word/2010/wordprocessingInk" xmlns:wne="http://schemas.microsoft.com/office/word/2006/wordml" xmlns:wps="http://schemas.microsoft.com/office/word/2010/wordprocessingShape" mc:Ignorable="w14 wp14">
   <w:body>
-    <w:p>
-      <w:pPr>
-        <w:spacing w:before="1680"/>
-        <w:jc w:val="center"/>
-      </w:pPr>
-      <w:r>
-        <w:rPr>
-          <w:rFonts w:ascii="Aptos" w:hAnsi="Aptos"/>
-          <w:b/>
-          <w:color w:val="5937D8"/>
-          <w:sz w:val="22"/>
-        </w:rPr>
-        <w:t>BONUS GRATIS</w:t>
-      </w:r>
-    </w:p>
-    <w:p>
-      <w:pPr>
-        <w:spacing w:before="320"/>
-        <w:jc w:val="center"/>
-      </w:pPr>
-      <w:r>
-        <w:rPr>
-          <w:rFonts w:ascii="Aptos Display" w:hAnsi="Aptos Display"/>
-          <w:b/>
-          <w:color w:val="14213D"/>
-          <w:sz w:val="62"/>
-        </w:rPr>
-        <w:t>Audit SBU–SKK</w:t>
-        <w:br/>
-      </w:r>
-      <w:r>
-        <w:rPr>
-          <w:rFonts w:ascii="Aptos Display" w:hAnsi="Aptos Display"/>
-          <w:b/>
-          <w:color w:val="14213D"/>
-          <w:sz w:val="62"/>
-        </w:rPr>
-        <w:t>14 Hari</w:t>
-      </w:r>
-    </w:p>
-    <w:p>
-      <w:pPr>
-        <w:spacing w:before="300" w:after="280"/>
-        <w:jc w:val="center"/>
-      </w:pPr>
-      <w:r>
-        <w:rPr>
-          <w:color w:val="46546D"/>
-          <w:sz w:val="26"/>
-        </w:rPr>
-        <w:t>Mini Ebook Teknis untuk Memetakan Gap, Menata Dokumen, dan Menentukan Prioritas Kepatuhan</w:t>
-      </w:r>
-    </w:p>
     <w:tbl>
       <w:tblPr>
         <w:tblW w:type="auto" w:w="0"/>
@@ -68,60 +15,150 @@
         <w:tc>
           <w:tcPr>
             <w:tcW w:type="dxa" w:w="10166"/>
-            <w:shd w:fill="EEEAFE"/>
+            <w:shd w:fill="080D1C"/>
             <w:tcBorders>
-              <w:top w:val="single" w:sz="4" w:color="C7BEF4"/>
-              <w:left w:val="single" w:sz="4" w:color="C7BEF4"/>
-              <w:bottom w:val="single" w:sz="4" w:color="C7BEF4"/>
-              <w:right w:val="single" w:sz="4" w:color="C7BEF4"/>
+              <w:top w:val="single" w:sz="4" w:color="273456"/>
+              <w:left w:val="single" w:sz="4" w:color="273456"/>
+              <w:bottom w:val="single" w:sz="4" w:color="273456"/>
+              <w:right w:val="single" w:sz="4" w:color="273456"/>
             </w:tcBorders>
           </w:tcPr>
           <w:p>
             <w:pPr>
-              <w:spacing w:after="40"/>
-              <w:jc w:val="center"/>
+              <w:jc w:val="left"/>
             </w:pPr>
             <w:r/>
             <w:r>
               <w:rPr>
-                <w:rFonts w:ascii="Aptos" w:hAnsi="Aptos"/>
+                <w:color w:val="24D6F2"/>
+                <w:sz w:val="30"/>
+              </w:rPr>
+              <w:t xml:space="preserve">◈  </w:t>
+            </w:r>
+            <w:r>
+              <w:rPr>
+                <w:rFonts w:ascii="Aptos Display" w:hAnsi="Aptos Display"/>
                 <w:b/>
-                <w:color w:val="5937D8"/>
-                <w:sz w:val="16"/>
+                <w:color w:val="24D6F2"/>
+                <w:sz w:val="38"/>
               </w:rPr>
-              <w:t>BONUS GRATIS • LEAD MAGNET • PRAKTIS DIGUNAKAN</w:t>
+              <w:t>GUSTAFTA</w:t>
+            </w:r>
+            <w:r>
+              <w:br/>
+            </w:r>
+            <w:r>
+              <w:rPr>
+                <w:color w:val="8390B0"/>
+                <w:sz w:val="14"/>
+              </w:rPr>
+              <w:t>SOLUSI CERDAS KONTRAKTOR INDONESIA</w:t>
+            </w:r>
+          </w:p>
+          <w:p>
+            <w:pPr>
+              <w:spacing w:before="760"/>
+            </w:pPr>
+            <w:r>
+              <w:rPr>
+                <w:b/>
+                <w:color w:val="62E0A9"/>
+                <w:sz w:val="18"/>
+              </w:rPr>
+              <w:t>BONUS GRATIS</w:t>
+            </w:r>
+          </w:p>
+          <w:p>
+            <w:pPr>
+              <w:spacing w:before="260"/>
+            </w:pPr>
+            <w:r>
+              <w:rPr>
+                <w:rFonts w:ascii="Aptos Display" w:hAnsi="Aptos Display"/>
+                <w:b/>
+                <w:color w:val="FFFFFF"/>
+                <w:sz w:val="58"/>
+              </w:rPr>
+              <w:t>Audit SBU–SKK</w:t>
+              <w:br/>
+            </w:r>
+            <w:r>
+              <w:rPr>
+                <w:rFonts w:ascii="Aptos Display" w:hAnsi="Aptos Display"/>
+                <w:b/>
+                <w:color w:val="FFFFFF"/>
+                <w:sz w:val="58"/>
+              </w:rPr>
+              <w:t>14 Hari</w:t>
+            </w:r>
+          </w:p>
+          <w:p>
+            <w:pPr>
+              <w:spacing w:before="260"/>
+            </w:pPr>
+            <w:r>
+              <w:rPr>
+                <w:color w:val="B3BDD5"/>
+                <w:sz w:val="24"/>
+              </w:rPr>
+              <w:t>Mini Ebook Teknis untuk Memetakan Gap, Menata Dokumen, dan Menentukan Prioritas Kepatuhan</w:t>
+            </w:r>
+          </w:p>
+          <w:tbl>
+            <w:tblPr>
+              <w:tblW w:type="auto" w:w="0"/>
+              <w:jc w:val="left"/>
+              <w:tblLook w:firstColumn="1" w:firstRow="1" w:lastColumn="0" w:lastRow="0" w:noHBand="0" w:noVBand="1" w:val="04A0"/>
+            </w:tblPr>
+            <w:tblGrid>
+              <w:gridCol w:w="10166"/>
+            </w:tblGrid>
+            <w:tr>
+              <w:tc>
+                <w:tcPr>
+                  <w:tcW w:type="dxa" w:w="10166"/>
+                  <w:shd w:fill="1A2340"/>
+                  <w:tcBorders>
+                    <w:top w:val="single" w:sz="4" w:color="3D4B78"/>
+                    <w:left w:val="single" w:sz="4" w:color="3D4B78"/>
+                    <w:bottom w:val="single" w:sz="4" w:color="3D4B78"/>
+                    <w:right w:val="single" w:sz="4" w:color="3D4B78"/>
+                  </w:tcBorders>
+                </w:tcPr>
+                <w:p>
+                  <w:pPr>
+                    <w:spacing w:after="40"/>
+                  </w:pPr>
+                  <w:r/>
+                  <w:r>
+                    <w:rPr>
+                      <w:rFonts w:ascii="Aptos" w:hAnsi="Aptos"/>
+                      <w:b/>
+                      <w:color w:val="24D6F2"/>
+                      <w:sz w:val="16"/>
+                    </w:rPr>
+                    <w:t>PDF 10 HALAMAN • LEAD MAGNET • PRAKTIS DIGUNAKAN</w:t>
+                  </w:r>
+                </w:p>
+              </w:tc>
+            </w:tr>
+          </w:tbl>
+          <w:p/>
+          <w:p>
+            <w:pPr>
+              <w:spacing w:before="880"/>
+            </w:pPr>
+            <w:r>
+              <w:rPr>
+                <w:color w:val="8390B0"/>
+                <w:sz w:val="18"/>
+              </w:rPr>
+              <w:t>GUSTAFTA  •  Edisi digital 2026</w:t>
             </w:r>
           </w:p>
         </w:tc>
       </w:tr>
     </w:tbl>
-    <w:p>
-      <w:pPr>
-        <w:spacing w:before="2800"/>
-        <w:jc w:val="center"/>
-      </w:pPr>
-      <w:r>
-        <w:rPr>
-          <w:rFonts w:ascii="Aptos" w:hAnsi="Aptos"/>
-          <w:b/>
-          <w:color w:val="14213D"/>
-          <w:sz w:val="22"/>
-        </w:rPr>
-        <w:t>[NAMA BRAND ANDA]</w:t>
-      </w:r>
-    </w:p>
-    <w:p>
-      <w:pPr>
-        <w:jc w:val="center"/>
-      </w:pPr>
-      <w:r>
-        <w:rPr>
-          <w:color w:val="6B7280"/>
-          <w:sz w:val="18"/>
-        </w:rPr>
-        <w:t>Edisi digital • 2026</w:t>
-      </w:r>
-    </w:p>
     <w:p>
       <w:r>
         <w:br w:type="page"/>

</xml_diff>